<commit_message>
Move TranslateOCR to guided browser setup
</commit_message>
<xml_diff>
--- a/dist/demo/assets/ar-final.docx
+++ b/dist/demo/assets/ar-final.docx
@@ -156,45 +156,43 @@
           </w:p>
         </w:tc>
       </w:tr>
-      <w:tr>
-        <w:trPr>
-          <w:cantSplit/>
-        </w:trPr>
-        <w:tc>
-          <w:tcPr>
-            <w:tcW w:w="3447" w:type="dxa"/>
-          </w:tcPr>
-          <w:p>
-            <w:pPr>
-              <w:bidi/>
-              <w:spacing w:before="0" w:after="0" w:line="348" w:lineRule="auto"/>
-            </w:pPr>
-            <w:r>
-              <w:rPr>
-                <w:rtl/>
-              </w:rPr>
-              <w:t xml:space="preserve">رقم الوثيقة</w:t>
-            </w:r>
-          </w:p>
-        </w:tc>
-        <w:tc>
-          <w:tcPr>
-            <w:tcW w:w="5625" w:type="dxa"/>
-          </w:tcPr>
-          <w:p>
-            <w:pPr>
-              <w:bidi/>
-              <w:spacing w:before="0" w:after="0" w:line="348" w:lineRule="auto"/>
-            </w:pPr>
-            <w:r>
-              <w:rPr>
-                <w:rtl/>
-              </w:rPr>
-              <w:t xml:space="preserve">DEMO-12345</w:t>
-            </w:r>
-          </w:p>
-        </w:tc>
-      </w:tr>
+    </w:tbl>
+    <w:p>
+      <w:pPr>
+        <w:bidi/>
+        <w:spacing w:before="0" w:after="90" w:line="348" w:lineRule="auto"/>
+      </w:pPr>
+      <w:r>
+        <w:rPr>
+          <w:rtl/>
+        </w:rPr>
+        <w:t xml:space="preserve">رقم الوثيقة: DEMO-12345</w:t>
+      </w:r>
+    </w:p>
+    <w:tbl>
+      <w:tblPr>
+        <w:tblW w:w="9072" w:type="dxa"/>
+        <w:tblLayout w:type="fixed"/>
+        <w:bidiVisual/>
+        <w:tblBorders>
+          <w:top w:val="single" w:sz="4" w:color="000000"/>
+          <w:left w:val="single" w:sz="4" w:color="000000"/>
+          <w:bottom w:val="single" w:sz="4" w:color="000000"/>
+          <w:right w:val="single" w:sz="4" w:color="000000"/>
+          <w:insideH w:val="single" w:sz="4" w:color="000000"/>
+          <w:insideV w:val="single" w:sz="4" w:color="000000"/>
+        </w:tblBorders>
+        <w:tblCellMar>
+          <w:top w:w="100" w:type="dxa"/>
+          <w:left w:w="120" w:type="dxa"/>
+          <w:bottom w:w="100" w:type="dxa"/>
+          <w:right w:w="120" w:type="dxa"/>
+        </w:tblCellMar>
+      </w:tblPr>
+      <w:tblGrid>
+        <w:gridCol w:w="3447"/>
+        <w:gridCol w:w="5625"/>
+      </w:tblGrid>
       <w:tr>
         <w:trPr>
           <w:cantSplit/>

</xml_diff>

<commit_message>
Prepare Foliquo desktop preview and workflow polish
</commit_message>
<xml_diff>
--- a/dist/demo/assets/ar-final.docx
+++ b/dist/demo/assets/ar-final.docx
@@ -245,30 +245,64 @@
         <w:t xml:space="preserve">(الوجه الخلفي)</w:t>
       </w:r>
     </w:p>
-    <w:p>
-      <w:pPr>
-        <w:bidi/>
-        <w:spacing w:before="0" w:after="90" w:line="348" w:lineRule="auto"/>
-      </w:pPr>
-      <w:r>
-        <w:rPr>
-          <w:rtl/>
-        </w:rPr>
-        <w:t xml:space="preserve">[الختم: جهة تجريبية خيالية]</w:t>
-      </w:r>
-    </w:p>
-    <w:p>
-      <w:pPr>
-        <w:bidi/>
-        <w:spacing w:before="0" w:after="90" w:line="348" w:lineRule="auto"/>
-      </w:pPr>
-      <w:r>
-        <w:rPr>
-          <w:rtl/>
-        </w:rPr>
-        <w:t xml:space="preserve">[يوجد توقيع]</w:t>
-      </w:r>
-    </w:p>
+    <w:tbl>
+      <w:tblPr>
+        <w:tblW w:w="9072" w:type="dxa"/>
+        <w:tblLayout w:type="fixed"/>
+        <w:bidiVisual/>
+        <w:tblBorders>
+          <w:top w:val="single" w:sz="4" w:color="000000"/>
+          <w:left w:val="single" w:sz="4" w:color="000000"/>
+          <w:bottom w:val="single" w:sz="4" w:color="000000"/>
+          <w:right w:val="single" w:sz="4" w:color="000000"/>
+          <w:insideH w:val="nil" w:sz="4" w:color="000000"/>
+          <w:insideV w:val="single" w:sz="4" w:color="000000"/>
+        </w:tblBorders>
+        <w:tblCellMar>
+          <w:top w:w="100" w:type="dxa"/>
+          <w:left w:w="120" w:type="dxa"/>
+          <w:bottom w:w="100" w:type="dxa"/>
+          <w:right w:w="120" w:type="dxa"/>
+        </w:tblCellMar>
+      </w:tblPr>
+      <w:tblGrid>
+        <w:gridCol w:w="9072"/>
+      </w:tblGrid>
+      <w:tr>
+        <w:trPr>
+          <w:cantSplit/>
+        </w:trPr>
+        <w:tc>
+          <w:tcPr>
+            <w:tcW w:w="9072" w:type="dxa"/>
+          </w:tcPr>
+          <w:p>
+            <w:pPr>
+              <w:bidi/>
+              <w:spacing w:before="0" w:after="0" w:line="348" w:lineRule="auto"/>
+            </w:pPr>
+            <w:r>
+              <w:rPr>
+                <w:rtl/>
+              </w:rPr>
+              <w:t xml:space="preserve">جهة تجريبية خيالية</w:t>
+            </w:r>
+          </w:p>
+          <w:p>
+            <w:pPr>
+              <w:bidi/>
+              <w:spacing w:before="0" w:after="0" w:line="348" w:lineRule="auto"/>
+            </w:pPr>
+            <w:r>
+              <w:rPr>
+                <w:rtl/>
+              </w:rPr>
+              <w:t xml:space="preserve">[يوجد توقيع]</w:t>
+            </w:r>
+          </w:p>
+        </w:tc>
+      </w:tr>
+    </w:tbl>
     <w:sectPr>
       <w:pgSz w:w="11906" w:h="16838"/>
       <w:headerReference w:type="default" r:id="rId2"/>

</xml_diff>

<commit_message>
feat: prepare Foliquo v0.11.9 desktop release
</commit_message>
<xml_diff>
--- a/dist/demo/assets/ar-final.docx
+++ b/dist/demo/assets/ar-final.docx
@@ -2,22 +2,6 @@
 <file path=word/document.xml><?xml version="1.0" encoding="utf-8"?>
 <w:document xmlns:r="http://schemas.openxmlformats.org/officeDocument/2006/relationships" xmlns:w="http://schemas.openxmlformats.org/wordprocessingml/2006/main">
   <w:body>
-    <w:p>
-      <w:pPr>
-        <w:pStyle w:val="Title"/>
-        <w:bidi/>
-        <w:jc w:val="center"/>
-        <w:spacing w:before="0" w:after="400" w:line="348" w:lineRule="auto"/>
-      </w:pPr>
-      <w:r>
-        <w:rPr>
-          <w:rtl/>
-          <w:b/>
-          <w:bCs/>
-        </w:rPr>
-        <w:t xml:space="preserve">ترجمة مصدّقة من الإنجليزية إلى العربية</w:t>
-      </w:r>
-    </w:p>
     <w:p>
       <w:pPr>
         <w:bidi/>
@@ -25,6 +9,8 @@
       </w:pPr>
       <w:r>
         <w:rPr>
+          <w:sz w:val="22"/>
+          <w:szCs w:val="22"/>
           <w:rtl/>
         </w:rPr>
         <w:t xml:space="preserve">مستند نموذجي خيالي</w:t>
@@ -37,6 +23,8 @@
       </w:pPr>
       <w:r>
         <w:rPr>
+          <w:sz w:val="22"/>
+          <w:szCs w:val="22"/>
           <w:rtl/>
         </w:rPr>
         <w:t xml:space="preserve">(الوجه الأمامي)</w:t>
@@ -81,6 +69,8 @@
             </w:pPr>
             <w:r>
               <w:rPr>
+                <w:sz w:val="22"/>
+                <w:szCs w:val="22"/>
                 <w:rtl/>
               </w:rPr>
               <w:t xml:space="preserve">الاسم</w:t>
@@ -98,9 +88,11 @@
             </w:pPr>
             <w:r>
               <w:rPr>
-                <w:rtl/>
-              </w:rPr>
-              <w:t xml:space="preserve">عمر حسن (Omar Hasan)</w:t>
+                <w:sz w:val="22"/>
+                <w:szCs w:val="22"/>
+                <w:rtl/>
+              </w:rPr>
+              <w:t xml:space="preserve">ليلى سمير نصار (Leila Samir Nassar)</w:t>
             </w:r>
           </w:p>
         </w:tc>
@@ -120,6 +112,8 @@
             </w:pPr>
             <w:r>
               <w:rPr>
+                <w:sz w:val="22"/>
+                <w:szCs w:val="22"/>
                 <w:rtl/>
               </w:rPr>
               <w:t xml:space="preserve">تاريخ الميلاد</w:t>
@@ -137,18 +131,24 @@
             </w:pPr>
             <w:r>
               <w:rPr>
+                <w:sz w:val="22"/>
+                <w:szCs w:val="22"/>
                 <w:rtl/>
               </w:rPr>
               <w:t xml:space="preserve"/>
             </w:r>
             <w:r>
               <w:rPr>
+                <w:sz w:val="22"/>
+                <w:szCs w:val="22"/>
                 <w:rtl w:val="0"/>
               </w:rPr>
-              <w:t xml:space="preserve">‎07.03.1998‎</w:t>
-            </w:r>
-            <w:r>
-              <w:rPr>
+              <w:t xml:space="preserve">‎18.09.1994‎</w:t>
+            </w:r>
+            <w:r>
+              <w:rPr>
+                <w:sz w:val="22"/>
+                <w:szCs w:val="22"/>
                 <w:rtl/>
               </w:rPr>
               <w:t xml:space="preserve"/>
@@ -164,9 +164,11 @@
       </w:pPr>
       <w:r>
         <w:rPr>
+          <w:sz w:val="22"/>
+          <w:szCs w:val="22"/>
           <w:rtl/>
         </w:rPr>
-        <w:t xml:space="preserve">رقم الوثيقة: DEMO-12345</w:t>
+        <w:t xml:space="preserve">رقم الوثيقة: FQ-DEMO-2048</w:t>
       </w:r>
     </w:p>
     <w:tbl>
@@ -208,6 +210,8 @@
             </w:pPr>
             <w:r>
               <w:rPr>
+                <w:sz w:val="22"/>
+                <w:szCs w:val="22"/>
                 <w:rtl/>
               </w:rPr>
               <w:t xml:space="preserve">السمات</w:t>
@@ -225,6 +229,8 @@
             </w:pPr>
             <w:r>
               <w:rPr>
+                <w:sz w:val="22"/>
+                <w:szCs w:val="22"/>
                 <w:rtl/>
               </w:rPr>
               <w:t xml:space="preserve">لا توجد سمات مميزة</w:t>
@@ -240,6 +246,8 @@
       </w:pPr>
       <w:r>
         <w:rPr>
+          <w:sz w:val="22"/>
+          <w:szCs w:val="22"/>
           <w:rtl/>
         </w:rPr>
         <w:t xml:space="preserve">(الوجه الخلفي)</w:t>
@@ -247,7 +255,7 @@
     </w:p>
     <w:tbl>
       <w:tblPr>
-        <w:tblW w:w="9072" w:type="dxa"/>
+        <w:tblW w:w="2416" w:type="dxa"/>
         <w:tblLayout w:type="fixed"/>
         <w:bidiVisual/>
         <w:tblBorders>
@@ -266,7 +274,7 @@
         </w:tblCellMar>
       </w:tblPr>
       <w:tblGrid>
-        <w:gridCol w:w="9072"/>
+        <w:gridCol w:w="2416"/>
       </w:tblGrid>
       <w:tr>
         <w:trPr>
@@ -274,15 +282,17 @@
         </w:trPr>
         <w:tc>
           <w:tcPr>
-            <w:tcW w:w="9072" w:type="dxa"/>
-          </w:tcPr>
-          <w:p>
-            <w:pPr>
-              <w:bidi/>
-              <w:spacing w:before="0" w:after="0" w:line="348" w:lineRule="auto"/>
-            </w:pPr>
-            <w:r>
-              <w:rPr>
+            <w:tcW w:w="2416" w:type="dxa"/>
+          </w:tcPr>
+          <w:p>
+            <w:pPr>
+              <w:bidi/>
+              <w:spacing w:before="0" w:after="0" w:line="348" w:lineRule="auto"/>
+            </w:pPr>
+            <w:r>
+              <w:rPr>
+                <w:sz w:val="22"/>
+                <w:szCs w:val="22"/>
                 <w:rtl/>
               </w:rPr>
               <w:t xml:space="preserve">جهة تجريبية خيالية</w:t>
@@ -295,9 +305,11 @@
             </w:pPr>
             <w:r>
               <w:rPr>
-                <w:rtl/>
-              </w:rPr>
-              <w:t xml:space="preserve">[يوجد توقيع]</w:t>
+                <w:sz w:val="22"/>
+                <w:szCs w:val="22"/>
+                <w:rtl/>
+              </w:rPr>
+              <w:t xml:space="preserve">[توقيع: غير مقروء]</w:t>
             </w:r>
           </w:p>
         </w:tc>
@@ -317,27 +329,24 @@
 <w:ftr xmlns:w="http://schemas.openxmlformats.org/wordprocessingml/2006/main">
   <w:p>
     <w:pPr>
-      <w:bidi/>
-      <w:spacing w:before="0" w:after="0" w:line="348" w:lineRule="auto"/>
+      <w:jc w:val="center"/>
     </w:pPr>
     <w:r>
       <w:rPr>
-        <w:rtl/>
+        <w:sz w:val="16"/>
       </w:rPr>
-      <w:t xml:space="preserve"/>
-    </w:r>
-  </w:p>
-  <w:p>
-    <w:pPr>
-      <w:jc w:val="center"/>
-    </w:pPr>
-    <w:r>
       <w:fldChar w:fldCharType="begin"/>
     </w:r>
     <w:r>
+      <w:rPr>
+        <w:sz w:val="16"/>
+      </w:rPr>
       <w:instrText> PAGE </w:instrText>
     </w:r>
     <w:r>
+      <w:rPr>
+        <w:sz w:val="16"/>
+      </w:rPr>
       <w:fldChar w:fldCharType="end"/>
     </w:r>
   </w:p>
@@ -349,13 +358,18 @@
   <w:p>
     <w:pPr>
       <w:bidi/>
+      <w:jc w:val="center"/>
       <w:spacing w:before="0" w:after="0" w:line="348" w:lineRule="auto"/>
     </w:pPr>
     <w:r>
       <w:rPr>
+        <w:sz w:val="22"/>
+        <w:szCs w:val="22"/>
         <w:rtl/>
+        <w:b/>
+        <w:bCs/>
       </w:rPr>
-      <w:t xml:space="preserve"/>
+      <w:t xml:space="preserve">ترجمة مصدّقة من الإنجليزية إلى العربية</w:t>
     </w:r>
   </w:p>
 </w:hdr>
@@ -366,9 +380,9 @@
   <w:docDefaults>
     <w:rPrDefault>
       <w:rPr>
-        <w:rFonts w:ascii="Times New Roman" w:hAnsi="Times New Roman" w:cs="Arial"/>
+        <w:rFonts w:ascii="Aptos" w:hAnsi="Aptos" w:eastAsia="Aptos" w:cs="Aptos"/>
         <w:sz w:val="22"/>
-        <w:szCs w:val="24"/>
+        <w:szCs w:val="22"/>
         <w:color w:val="000000"/>
         <w:lang w:val="de-AT" w:bidi="ar-SA"/>
       </w:rPr>
@@ -376,18 +390,10 @@
   </w:docDefaults>
   <w:style w:type="paragraph" w:default="1" w:styleId="Normal">
     <w:name w:val="Normal"/>
-  </w:style>
-  <w:style w:type="paragraph" w:styleId="Title">
-    <w:name w:val="Title"/>
-    <w:basedOn w:val="Normal"/>
-    <w:pPr>
-      <w:keepNext/>
-      <w:jc w:val="center"/>
-    </w:pPr>
     <w:rPr>
-      <w:b/>
-      <w:sz w:val="26"/>
-      <w:color w:val="000000"/>
+      <w:rFonts w:ascii="Aptos" w:hAnsi="Aptos" w:eastAsia="Aptos" w:cs="Aptos"/>
+      <w:sz w:val="22"/>
+      <w:szCs w:val="22"/>
     </w:rPr>
   </w:style>
 </w:styles>

</xml_diff>